<commit_message>
update the user guide
</commit_message>
<xml_diff>
--- a/docs/Synthetic Data Generation User Guide.docx
+++ b/docs/Synthetic Data Generation User Guide.docx
@@ -58,7 +58,16 @@
         </w:rPr>
       </w:pPr>
       <w:r>
-        <w:t>Updated March 2025</w:t>
+        <w:t xml:space="preserve">Updated </w:t>
+      </w:r>
+      <w:r>
+        <w:t>May</w:t>
+      </w:r>
+      <w:r>
+        <w:t xml:space="preserve"> 202</w:t>
+      </w:r>
+      <w:r>
+        <w:t>6</w:t>
       </w:r>
       <w:r>
         <w:br w:type="page"/>
@@ -116,7 +125,7 @@
           <w:r>
             <w:fldChar w:fldCharType="separate"/>
           </w:r>
-          <w:hyperlink w:anchor="_Toc191981966" w:history="1">
+          <w:hyperlink w:anchor="_Toc230895631" w:history="1">
             <w:r>
               <w:rPr>
                 <w:rStyle w:val="Hyperlink"/>
@@ -143,7 +152,7 @@
                 <w:noProof/>
                 <w:webHidden/>
               </w:rPr>
-              <w:instrText xml:space="preserve"> PAGEREF _Toc191981966 \h </w:instrText>
+              <w:instrText xml:space="preserve"> PAGEREF _Toc230895631 \h </w:instrText>
             </w:r>
             <w:r>
               <w:rPr>
@@ -185,7 +194,7 @@
               <w:noProof/>
             </w:rPr>
           </w:pPr>
-          <w:hyperlink w:anchor="_Toc191981967" w:history="1">
+          <w:hyperlink w:anchor="_Toc230895632" w:history="1">
             <w:r>
               <w:rPr>
                 <w:rStyle w:val="Hyperlink"/>
@@ -212,7 +221,7 @@
                 <w:noProof/>
                 <w:webHidden/>
               </w:rPr>
-              <w:instrText xml:space="preserve"> PAGEREF _Toc191981967 \h </w:instrText>
+              <w:instrText xml:space="preserve"> PAGEREF _Toc230895632 \h </w:instrText>
             </w:r>
             <w:r>
               <w:rPr>
@@ -254,7 +263,7 @@
               <w:noProof/>
             </w:rPr>
           </w:pPr>
-          <w:hyperlink w:anchor="_Toc191981968" w:history="1">
+          <w:hyperlink w:anchor="_Toc230895633" w:history="1">
             <w:r>
               <w:rPr>
                 <w:rStyle w:val="Hyperlink"/>
@@ -281,7 +290,7 @@
                 <w:noProof/>
                 <w:webHidden/>
               </w:rPr>
-              <w:instrText xml:space="preserve"> PAGEREF _Toc191981968 \h </w:instrText>
+              <w:instrText xml:space="preserve"> PAGEREF _Toc230895633 \h </w:instrText>
             </w:r>
             <w:r>
               <w:rPr>
@@ -323,7 +332,7 @@
               <w:noProof/>
             </w:rPr>
           </w:pPr>
-          <w:hyperlink w:anchor="_Toc191981969" w:history="1">
+          <w:hyperlink w:anchor="_Toc230895634" w:history="1">
             <w:r>
               <w:rPr>
                 <w:rStyle w:val="Hyperlink"/>
@@ -350,7 +359,7 @@
                 <w:noProof/>
                 <w:webHidden/>
               </w:rPr>
-              <w:instrText xml:space="preserve"> PAGEREF _Toc191981969 \h </w:instrText>
+              <w:instrText xml:space="preserve"> PAGEREF _Toc230895634 \h </w:instrText>
             </w:r>
             <w:r>
               <w:rPr>
@@ -392,7 +401,7 @@
               <w:noProof/>
             </w:rPr>
           </w:pPr>
-          <w:hyperlink w:anchor="_Toc191981970" w:history="1">
+          <w:hyperlink w:anchor="_Toc230895635" w:history="1">
             <w:r>
               <w:rPr>
                 <w:rStyle w:val="Hyperlink"/>
@@ -419,7 +428,7 @@
                 <w:noProof/>
                 <w:webHidden/>
               </w:rPr>
-              <w:instrText xml:space="preserve"> PAGEREF _Toc191981970 \h </w:instrText>
+              <w:instrText xml:space="preserve"> PAGEREF _Toc230895635 \h </w:instrText>
             </w:r>
             <w:r>
               <w:rPr>
@@ -461,7 +470,7 @@
               <w:noProof/>
             </w:rPr>
           </w:pPr>
-          <w:hyperlink w:anchor="_Toc191981971" w:history="1">
+          <w:hyperlink w:anchor="_Toc230895636" w:history="1">
             <w:r>
               <w:rPr>
                 <w:rStyle w:val="Hyperlink"/>
@@ -488,7 +497,7 @@
                 <w:noProof/>
                 <w:webHidden/>
               </w:rPr>
-              <w:instrText xml:space="preserve"> PAGEREF _Toc191981971 \h </w:instrText>
+              <w:instrText xml:space="preserve"> PAGEREF _Toc230895636 \h </w:instrText>
             </w:r>
             <w:r>
               <w:rPr>
@@ -530,7 +539,7 @@
               <w:noProof/>
             </w:rPr>
           </w:pPr>
-          <w:hyperlink w:anchor="_Toc191981972" w:history="1">
+          <w:hyperlink w:anchor="_Toc230895637" w:history="1">
             <w:r>
               <w:rPr>
                 <w:rStyle w:val="Hyperlink"/>
@@ -557,7 +566,7 @@
                 <w:noProof/>
                 <w:webHidden/>
               </w:rPr>
-              <w:instrText xml:space="preserve"> PAGEREF _Toc191981972 \h </w:instrText>
+              <w:instrText xml:space="preserve"> PAGEREF _Toc230895637 \h </w:instrText>
             </w:r>
             <w:r>
               <w:rPr>
@@ -599,7 +608,7 @@
               <w:noProof/>
             </w:rPr>
           </w:pPr>
-          <w:hyperlink w:anchor="_Toc191981973" w:history="1">
+          <w:hyperlink w:anchor="_Toc230895638" w:history="1">
             <w:r>
               <w:rPr>
                 <w:rStyle w:val="Hyperlink"/>
@@ -626,7 +635,7 @@
                 <w:noProof/>
                 <w:webHidden/>
               </w:rPr>
-              <w:instrText xml:space="preserve"> PAGEREF _Toc191981973 \h </w:instrText>
+              <w:instrText xml:space="preserve"> PAGEREF _Toc230895638 \h </w:instrText>
             </w:r>
             <w:r>
               <w:rPr>
@@ -668,7 +677,7 @@
               <w:noProof/>
             </w:rPr>
           </w:pPr>
-          <w:hyperlink w:anchor="_Toc191981974" w:history="1">
+          <w:hyperlink w:anchor="_Toc230895639" w:history="1">
             <w:r>
               <w:rPr>
                 <w:rStyle w:val="Hyperlink"/>
@@ -695,7 +704,7 @@
                 <w:noProof/>
                 <w:webHidden/>
               </w:rPr>
-              <w:instrText xml:space="preserve"> PAGEREF _Toc191981974 \h </w:instrText>
+              <w:instrText xml:space="preserve"> PAGEREF _Toc230895639 \h </w:instrText>
             </w:r>
             <w:r>
               <w:rPr>
@@ -737,7 +746,7 @@
               <w:noProof/>
             </w:rPr>
           </w:pPr>
-          <w:hyperlink w:anchor="_Toc191981975" w:history="1">
+          <w:hyperlink w:anchor="_Toc230895640" w:history="1">
             <w:r>
               <w:rPr>
                 <w:rStyle w:val="Hyperlink"/>
@@ -764,7 +773,7 @@
                 <w:noProof/>
                 <w:webHidden/>
               </w:rPr>
-              <w:instrText xml:space="preserve"> PAGEREF _Toc191981975 \h </w:instrText>
+              <w:instrText xml:space="preserve"> PAGEREF _Toc230895640 \h </w:instrText>
             </w:r>
             <w:r>
               <w:rPr>
@@ -806,7 +815,7 @@
               <w:noProof/>
             </w:rPr>
           </w:pPr>
-          <w:hyperlink w:anchor="_Toc191981976" w:history="1">
+          <w:hyperlink w:anchor="_Toc230895641" w:history="1">
             <w:r>
               <w:rPr>
                 <w:rStyle w:val="Hyperlink"/>
@@ -833,7 +842,7 @@
                 <w:noProof/>
                 <w:webHidden/>
               </w:rPr>
-              <w:instrText xml:space="preserve"> PAGEREF _Toc191981976 \h </w:instrText>
+              <w:instrText xml:space="preserve"> PAGEREF _Toc230895641 \h </w:instrText>
             </w:r>
             <w:r>
               <w:rPr>
@@ -875,7 +884,7 @@
               <w:noProof/>
             </w:rPr>
           </w:pPr>
-          <w:hyperlink w:anchor="_Toc191981977" w:history="1">
+          <w:hyperlink w:anchor="_Toc230895642" w:history="1">
             <w:r>
               <w:rPr>
                 <w:rStyle w:val="Hyperlink"/>
@@ -902,7 +911,7 @@
                 <w:noProof/>
                 <w:webHidden/>
               </w:rPr>
-              <w:instrText xml:space="preserve"> PAGEREF _Toc191981977 \h </w:instrText>
+              <w:instrText xml:space="preserve"> PAGEREF _Toc230895642 \h </w:instrText>
             </w:r>
             <w:r>
               <w:rPr>
@@ -944,7 +953,7 @@
               <w:noProof/>
             </w:rPr>
           </w:pPr>
-          <w:hyperlink w:anchor="_Toc191981978" w:history="1">
+          <w:hyperlink w:anchor="_Toc230895643" w:history="1">
             <w:r>
               <w:rPr>
                 <w:rStyle w:val="Hyperlink"/>
@@ -971,7 +980,7 @@
                 <w:noProof/>
                 <w:webHidden/>
               </w:rPr>
-              <w:instrText xml:space="preserve"> PAGEREF _Toc191981978 \h </w:instrText>
+              <w:instrText xml:space="preserve"> PAGEREF _Toc230895643 \h </w:instrText>
             </w:r>
             <w:r>
               <w:rPr>
@@ -1013,7 +1022,7 @@
               <w:noProof/>
             </w:rPr>
           </w:pPr>
-          <w:hyperlink w:anchor="_Toc191981979" w:history="1">
+          <w:hyperlink w:anchor="_Toc230895644" w:history="1">
             <w:r>
               <w:rPr>
                 <w:rStyle w:val="Hyperlink"/>
@@ -1040,7 +1049,7 @@
                 <w:noProof/>
                 <w:webHidden/>
               </w:rPr>
-              <w:instrText xml:space="preserve"> PAGEREF _Toc191981979 \h </w:instrText>
+              <w:instrText xml:space="preserve"> PAGEREF _Toc230895644 \h </w:instrText>
             </w:r>
             <w:r>
               <w:rPr>
@@ -1082,7 +1091,7 @@
               <w:noProof/>
             </w:rPr>
           </w:pPr>
-          <w:hyperlink w:anchor="_Toc191981980" w:history="1">
+          <w:hyperlink w:anchor="_Toc230895645" w:history="1">
             <w:r>
               <w:rPr>
                 <w:rStyle w:val="Hyperlink"/>
@@ -1109,7 +1118,7 @@
                 <w:noProof/>
                 <w:webHidden/>
               </w:rPr>
-              <w:instrText xml:space="preserve"> PAGEREF _Toc191981980 \h </w:instrText>
+              <w:instrText xml:space="preserve"> PAGEREF _Toc230895645 \h </w:instrText>
             </w:r>
             <w:r>
               <w:rPr>
@@ -1151,7 +1160,7 @@
               <w:noProof/>
             </w:rPr>
           </w:pPr>
-          <w:hyperlink w:anchor="_Toc191981981" w:history="1">
+          <w:hyperlink w:anchor="_Toc230895646" w:history="1">
             <w:r>
               <w:rPr>
                 <w:rStyle w:val="Hyperlink"/>
@@ -1178,7 +1187,7 @@
                 <w:noProof/>
                 <w:webHidden/>
               </w:rPr>
-              <w:instrText xml:space="preserve"> PAGEREF _Toc191981981 \h </w:instrText>
+              <w:instrText xml:space="preserve"> PAGEREF _Toc230895646 \h </w:instrText>
             </w:r>
             <w:r>
               <w:rPr>
@@ -1220,7 +1229,7 @@
               <w:noProof/>
             </w:rPr>
           </w:pPr>
-          <w:hyperlink w:anchor="_Toc191981982" w:history="1">
+          <w:hyperlink w:anchor="_Toc230895647" w:history="1">
             <w:r>
               <w:rPr>
                 <w:rStyle w:val="Hyperlink"/>
@@ -1247,7 +1256,7 @@
                 <w:noProof/>
                 <w:webHidden/>
               </w:rPr>
-              <w:instrText xml:space="preserve"> PAGEREF _Toc191981982 \h </w:instrText>
+              <w:instrText xml:space="preserve"> PAGEREF _Toc230895647 \h </w:instrText>
             </w:r>
             <w:r>
               <w:rPr>
@@ -1268,6 +1277,75 @@
                 <w:webHidden/>
               </w:rPr>
               <w:t>7</w:t>
+            </w:r>
+            <w:r>
+              <w:rPr>
+                <w:noProof/>
+                <w:webHidden/>
+              </w:rPr>
+              <w:fldChar w:fldCharType="end"/>
+            </w:r>
+          </w:hyperlink>
+        </w:p>
+        <w:p>
+          <w:pPr>
+            <w:pStyle w:val="TOC1"/>
+            <w:tabs>
+              <w:tab w:val="right" w:leader="dot" w:pos="9350"/>
+            </w:tabs>
+            <w:rPr>
+              <w:rFonts w:eastAsiaTheme="minorEastAsia"/>
+              <w:noProof/>
+            </w:rPr>
+          </w:pPr>
+          <w:hyperlink w:anchor="_Toc230895648" w:history="1">
+            <w:r>
+              <w:rPr>
+                <w:rStyle w:val="Hyperlink"/>
+                <w:noProof/>
+              </w:rPr>
+              <w:t>Using the general-purpose Branch</w:t>
+            </w:r>
+            <w:r>
+              <w:rPr>
+                <w:noProof/>
+                <w:webHidden/>
+              </w:rPr>
+              <w:tab/>
+            </w:r>
+            <w:r>
+              <w:rPr>
+                <w:noProof/>
+                <w:webHidden/>
+              </w:rPr>
+              <w:fldChar w:fldCharType="begin"/>
+            </w:r>
+            <w:r>
+              <w:rPr>
+                <w:noProof/>
+                <w:webHidden/>
+              </w:rPr>
+              <w:instrText xml:space="preserve"> PAGEREF _Toc230895648 \h </w:instrText>
+            </w:r>
+            <w:r>
+              <w:rPr>
+                <w:noProof/>
+                <w:webHidden/>
+              </w:rPr>
+            </w:r>
+            <w:r>
+              <w:rPr>
+                <w:noProof/>
+                <w:webHidden/>
+              </w:rPr>
+              <w:fldChar w:fldCharType="separate"/>
+            </w:r>
+            <w:r>
+              <w:rPr>
+                <w:noProof/>
+                <w:webHidden/>
+              </w:rPr>
+              <w:t>9</w:t>
             </w:r>
             <w:r>
               <w:rPr>
@@ -1308,7 +1386,7 @@
       <w:pPr>
         <w:pStyle w:val="Heading1"/>
       </w:pPr>
-      <w:bookmarkStart w:id="0" w:name="_Toc191981966"/>
+      <w:bookmarkStart w:id="0" w:name="_Toc230895631"/>
       <w:r>
         <w:lastRenderedPageBreak/>
         <w:t>Introduction</w:t>
@@ -1356,7 +1434,7 @@
       <w:pPr>
         <w:pStyle w:val="Heading1"/>
       </w:pPr>
-      <w:bookmarkStart w:id="1" w:name="_Toc191981967"/>
+      <w:bookmarkStart w:id="1" w:name="_Toc230895632"/>
       <w:r>
         <w:t>Environment</w:t>
       </w:r>
@@ -1366,7 +1444,7 @@
       <w:pPr>
         <w:pStyle w:val="Heading2"/>
       </w:pPr>
-      <w:bookmarkStart w:id="2" w:name="_Toc191981968"/>
+      <w:bookmarkStart w:id="2" w:name="_Toc230895633"/>
       <w:r>
         <w:t>BlueMax7</w:t>
       </w:r>
@@ -1406,22 +1484,14 @@
         <w:t xml:space="preserve"> </w:t>
       </w:r>
       <w:r>
-        <w:t>“BlueMax7.2\Bin\</w:t>
-      </w:r>
-      <w:proofErr w:type="spellStart"/>
-      <w:r>
-        <w:t>BlueMax.config</w:t>
-      </w:r>
-      <w:proofErr w:type="spellEnd"/>
-      <w:r>
-        <w:t>” to reflect the installation directory.</w:t>
+        <w:t>“BlueMax7.2\Bin\BlueMax.config” to reflect the installation directory.</w:t>
       </w:r>
     </w:p>
     <w:p>
       <w:pPr>
         <w:pStyle w:val="Heading2"/>
       </w:pPr>
-      <w:bookmarkStart w:id="3" w:name="_Toc191981969"/>
+      <w:bookmarkStart w:id="3" w:name="_Toc230895634"/>
       <w:r>
         <w:t>X-Plane 12</w:t>
       </w:r>
@@ -1447,8 +1517,7 @@
       <w:pPr>
         <w:pStyle w:val="Heading2"/>
       </w:pPr>
-      <w:bookmarkStart w:id="4" w:name="_Toc191981970"/>
-      <w:proofErr w:type="spellStart"/>
+      <w:bookmarkStart w:id="4" w:name="_Toc230895635"/>
       <w:r>
         <w:t>Synth</w:t>
       </w:r>
@@ -1458,7 +1527,6 @@
       <w:r>
         <w:t>Data</w:t>
       </w:r>
-      <w:proofErr w:type="spellEnd"/>
       <w:r>
         <w:t xml:space="preserve"> Project</w:t>
       </w:r>
@@ -1466,21 +1534,13 @@
     </w:p>
     <w:p>
       <w:r>
-        <w:t xml:space="preserve">A local Visual Studio 2019 C++ development environment is required to build the </w:t>
-      </w:r>
-      <w:proofErr w:type="spellStart"/>
-      <w:r>
-        <w:t>Synth</w:t>
+        <w:t>A local Visual Studio 2019 C++ development environment is required to build the Synth</w:t>
       </w:r>
       <w:r>
         <w:t>etic</w:t>
       </w:r>
       <w:r>
-        <w:t>Data</w:t>
-      </w:r>
-      <w:proofErr w:type="spellEnd"/>
-      <w:r>
-        <w:t xml:space="preserve"> project. </w:t>
+        <w:t xml:space="preserve">Data project. </w:t>
       </w:r>
     </w:p>
     <w:p>
@@ -1550,7 +1610,7 @@
       <w:pPr>
         <w:pStyle w:val="Heading1"/>
       </w:pPr>
-      <w:bookmarkStart w:id="5" w:name="_Toc191981971"/>
+      <w:bookmarkStart w:id="5" w:name="_Toc230895636"/>
       <w:r>
         <w:t>Scenario</w:t>
       </w:r>
@@ -1741,178 +1801,16 @@
         </w:numPr>
       </w:pPr>
       <w:r>
-        <w:t>Add the following line to the scenario just before the “</w:t>
-      </w:r>
-      <w:proofErr w:type="spellStart"/>
-      <w:r>
-        <w:t>InitializeBlueMax</w:t>
-      </w:r>
-      <w:proofErr w:type="spellEnd"/>
-      <w:r>
-        <w:t>” command:</w:t>
+        <w:t>Add the following line to the scenario just before the “InitializeBlueMax” command:</w:t>
       </w:r>
     </w:p>
     <w:p>
       <w:pPr>
         <w:pStyle w:val="Code"/>
       </w:pPr>
-      <w:proofErr w:type="spellStart"/>
-      <w:r>
-        <w:t>UserVariable</w:t>
-      </w:r>
-      <w:proofErr w:type="spellEnd"/>
-      <w:r>
-        <w:t xml:space="preserve"> </w:t>
-      </w:r>
-      <w:proofErr w:type="spellStart"/>
-      <w:r>
-        <w:t>actime</w:t>
-      </w:r>
-      <w:proofErr w:type="spellEnd"/>
-      <w:r>
-        <w:t xml:space="preserve"> </w:t>
-      </w:r>
-      <w:proofErr w:type="spellStart"/>
-      <w:r>
-        <w:t>aclatd</w:t>
-      </w:r>
-      <w:proofErr w:type="spellEnd"/>
-      <w:r>
-        <w:t xml:space="preserve"> </w:t>
-      </w:r>
-      <w:proofErr w:type="spellStart"/>
-      <w:r>
-        <w:t>aclond</w:t>
-      </w:r>
-      <w:proofErr w:type="spellEnd"/>
-      <w:r>
-        <w:t xml:space="preserve"> </w:t>
-      </w:r>
-      <w:proofErr w:type="spellStart"/>
-      <w:r>
-        <w:t>acaltf</w:t>
-      </w:r>
-      <w:proofErr w:type="spellEnd"/>
-      <w:r>
-        <w:t xml:space="preserve"> </w:t>
-      </w:r>
-      <w:proofErr w:type="spellStart"/>
-      <w:r>
-        <w:t>acphid</w:t>
-      </w:r>
-      <w:proofErr w:type="spellEnd"/>
-      <w:r>
-        <w:t xml:space="preserve"> </w:t>
-      </w:r>
-      <w:proofErr w:type="spellStart"/>
-      <w:r>
-        <w:t>acthtad</w:t>
-      </w:r>
-      <w:proofErr w:type="spellEnd"/>
-      <w:r>
-        <w:t xml:space="preserve"> </w:t>
-      </w:r>
-      <w:proofErr w:type="spellStart"/>
-      <w:r>
-        <w:t>acpsid</w:t>
-      </w:r>
-      <w:proofErr w:type="spellEnd"/>
-      <w:r>
-        <w:t xml:space="preserve"> </w:t>
-      </w:r>
-      <w:proofErr w:type="spellStart"/>
-      <w:r>
-        <w:t>acvxi</w:t>
-      </w:r>
-      <w:proofErr w:type="spellEnd"/>
-      <w:r>
-        <w:t xml:space="preserve"> </w:t>
-      </w:r>
-      <w:proofErr w:type="spellStart"/>
-      <w:r>
-        <w:t>acvyi</w:t>
-      </w:r>
-      <w:proofErr w:type="spellEnd"/>
-      <w:r>
-        <w:t xml:space="preserve"> </w:t>
-      </w:r>
-      <w:proofErr w:type="spellStart"/>
-      <w:r>
-        <w:t>acvzi</w:t>
-      </w:r>
-      <w:proofErr w:type="spellEnd"/>
-      <w:r>
-        <w:t xml:space="preserve"> </w:t>
-      </w:r>
-      <w:proofErr w:type="spellStart"/>
-      <w:r>
-        <w:t>acaxi</w:t>
-      </w:r>
-      <w:proofErr w:type="spellEnd"/>
-      <w:r>
-        <w:t xml:space="preserve"> </w:t>
-      </w:r>
-      <w:proofErr w:type="spellStart"/>
-      <w:r>
-        <w:t>acayi</w:t>
-      </w:r>
-      <w:proofErr w:type="spellEnd"/>
-      <w:r>
-        <w:t xml:space="preserve"> </w:t>
-      </w:r>
-      <w:proofErr w:type="spellStart"/>
-      <w:r>
-        <w:t>acazi</w:t>
-      </w:r>
-      <w:proofErr w:type="spellEnd"/>
-      <w:r>
-        <w:t xml:space="preserve"> </w:t>
-      </w:r>
-      <w:proofErr w:type="spellStart"/>
-      <w:r>
-        <w:t>acaoad</w:t>
-      </w:r>
-      <w:proofErr w:type="spellEnd"/>
-      <w:r>
-        <w:t xml:space="preserve"> </w:t>
-      </w:r>
-      <w:proofErr w:type="spellStart"/>
-      <w:r>
-        <w:t>acnzb</w:t>
-      </w:r>
-      <w:proofErr w:type="spellEnd"/>
-      <w:r>
-        <w:t xml:space="preserve"> </w:t>
-      </w:r>
-      <w:proofErr w:type="spellStart"/>
-      <w:r>
-        <w:t>acmagd</w:t>
-      </w:r>
-      <w:proofErr w:type="spellEnd"/>
-      <w:r>
-        <w:t xml:space="preserve"> </w:t>
-      </w:r>
-      <w:proofErr w:type="spellStart"/>
-      <w:r>
-        <w:t>acktas</w:t>
-      </w:r>
-      <w:proofErr w:type="spellEnd"/>
-      <w:r>
-        <w:t xml:space="preserve"> </w:t>
-      </w:r>
-      <w:proofErr w:type="spellStart"/>
-      <w:r>
-        <w:t>cmthro</w:t>
-      </w:r>
-      <w:proofErr w:type="spellEnd"/>
-      <w:r>
-        <w:t xml:space="preserve"> </w:t>
-      </w:r>
-      <w:proofErr w:type="spellStart"/>
-      <w:r>
-        <w:t>acgear</w:t>
-      </w:r>
-      <w:proofErr w:type="spellEnd"/>
+      <w:r>
+        <w:t>UserVariable actime aclatd aclond acaltf acphid acthtad acpsid acvxi acvyi acvzi acaxi acayi acazi acaoad acnzb acmagd acktas cmthro acgear</w:t>
+      </w:r>
     </w:p>
     <w:p>
       <w:pPr>
@@ -1923,15 +1821,7 @@
         </w:numPr>
       </w:pPr>
       <w:r>
-        <w:t>Add Flight Segments as desired (see Simultaneous Four .</w:t>
-      </w:r>
-      <w:proofErr w:type="spellStart"/>
-      <w:r>
-        <w:t>scn</w:t>
-      </w:r>
-      <w:proofErr w:type="spellEnd"/>
-      <w:r>
-        <w:t xml:space="preserve"> files for examples)</w:t>
+        <w:t>Add Flight Segments as desired (see Simultaneous Four .scn files for examples)</w:t>
       </w:r>
     </w:p>
     <w:p>
@@ -1955,15 +1845,7 @@
         </w:numPr>
       </w:pPr>
       <w:r>
-        <w:t xml:space="preserve">Generate flight data by clicking “Run </w:t>
-      </w:r>
-      <w:proofErr w:type="spellStart"/>
-      <w:r>
-        <w:t>BlueMax</w:t>
-      </w:r>
-      <w:proofErr w:type="spellEnd"/>
-      <w:r>
-        <w:t xml:space="preserve"> 7”</w:t>
+        <w:t>Generate flight data by clicking “Run BlueMax 7”</w:t>
       </w:r>
       <w:r>
         <w:t xml:space="preserve">. The CSV output is written to a file with a “_UDO.txt” suffix. </w:t>
@@ -1977,23 +1859,7 @@
         <w:t xml:space="preserve">the </w:t>
       </w:r>
       <w:r>
-        <w:t xml:space="preserve">plots for any relevant data (e.g. </w:t>
-      </w:r>
-      <w:proofErr w:type="spellStart"/>
-      <w:r>
-        <w:t>lat</w:t>
-      </w:r>
-      <w:proofErr w:type="spellEnd"/>
-      <w:r>
-        <w:t>/</w:t>
-      </w:r>
-      <w:proofErr w:type="spellStart"/>
-      <w:r>
-        <w:t>lon</w:t>
-      </w:r>
-      <w:proofErr w:type="spellEnd"/>
-      <w:r>
-        <w:t>, altitude, airspeed, roll, pitch, etc.). For a simple visualization of the flight, click “Run HIVE”. A visual simulation will begin</w:t>
+        <w:t>plots for any relevant data (e.g. lat/lon, altitude, airspeed, roll, pitch, etc.). For a simple visualization of the flight, click “Run HIVE”. A visual simulation will begin</w:t>
       </w:r>
       <w:r>
         <w:t xml:space="preserve"> which enables</w:t>
@@ -2055,7 +1921,7 @@
       <w:pPr>
         <w:pStyle w:val="Heading1"/>
       </w:pPr>
-      <w:bookmarkStart w:id="6" w:name="_Toc191981972"/>
+      <w:bookmarkStart w:id="6" w:name="_Toc230895637"/>
       <w:r>
         <w:lastRenderedPageBreak/>
         <w:t xml:space="preserve">Data </w:t>
@@ -2069,7 +1935,7 @@
       <w:pPr>
         <w:pStyle w:val="Heading2"/>
       </w:pPr>
-      <w:bookmarkStart w:id="7" w:name="_Toc191981973"/>
+      <w:bookmarkStart w:id="7" w:name="_Toc230895638"/>
       <w:r>
         <w:t>Convert to SQLite Database</w:t>
       </w:r>
@@ -2111,7 +1977,6 @@
       <w:r>
         <w:t>BM6toDB.exe &lt;</w:t>
       </w:r>
-      <w:proofErr w:type="spellStart"/>
       <w:r>
         <w:t>input</w:t>
       </w:r>
@@ -2127,21 +1992,15 @@
       <w:r>
         <w:t>ata</w:t>
       </w:r>
-      <w:proofErr w:type="spellEnd"/>
       <w:r>
         <w:t>&gt;</w:t>
       </w:r>
       <w:r>
-        <w:t xml:space="preserve"> &lt;</w:t>
-      </w:r>
-      <w:proofErr w:type="spellStart"/>
-      <w:r>
-        <w:t>output</w:t>
+        <w:t xml:space="preserve"> &lt;output</w:t>
       </w:r>
       <w:r>
         <w:t>_db</w:t>
       </w:r>
-      <w:proofErr w:type="spellEnd"/>
       <w:r>
         <w:t>&gt;</w:t>
       </w:r>
@@ -2150,7 +2009,7 @@
       <w:pPr>
         <w:pStyle w:val="Heading2"/>
       </w:pPr>
-      <w:bookmarkStart w:id="8" w:name="_Toc191981974"/>
+      <w:bookmarkStart w:id="8" w:name="_Toc230895639"/>
       <w:r>
         <w:t>Video Generation with X-Plane 12</w:t>
       </w:r>
@@ -2174,7 +2033,7 @@
       <w:pPr>
         <w:pStyle w:val="Heading3"/>
       </w:pPr>
-      <w:bookmarkStart w:id="9" w:name="_Toc191981975"/>
+      <w:bookmarkStart w:id="9" w:name="_Toc230895640"/>
       <w:r>
         <w:t>Set up X-Plane</w:t>
       </w:r>
@@ -2377,7 +2236,7 @@
       <w:pPr>
         <w:pStyle w:val="Heading3"/>
       </w:pPr>
-      <w:bookmarkStart w:id="10" w:name="_Toc191981976"/>
+      <w:bookmarkStart w:id="10" w:name="_Toc230895641"/>
       <w:r>
         <w:t>Check UDP</w:t>
       </w:r>
@@ -2440,7 +2299,7 @@
       <w:pPr>
         <w:pStyle w:val="Heading3"/>
       </w:pPr>
-      <w:bookmarkStart w:id="11" w:name="_Toc191981977"/>
+      <w:bookmarkStart w:id="11" w:name="_Toc230895642"/>
       <w:r>
         <w:t>Test Video Output</w:t>
       </w:r>
@@ -2462,30 +2321,14 @@
         <w:pStyle w:val="Code"/>
       </w:pPr>
       <w:r>
-        <w:t>BM6toXPlaneVideo -t &lt;</w:t>
-      </w:r>
-      <w:proofErr w:type="spellStart"/>
-      <w:r>
-        <w:t>input_flight_data</w:t>
-      </w:r>
-      <w:proofErr w:type="spellEnd"/>
-      <w:r>
-        <w:t>&gt; -M &lt;</w:t>
-      </w:r>
-      <w:proofErr w:type="spellStart"/>
-      <w:r>
-        <w:t>output_video_pathname</w:t>
-      </w:r>
-      <w:proofErr w:type="spellEnd"/>
-      <w:r>
-        <w:t>&gt;</w:t>
+        <w:t>BM6toXPlaneVideo -t &lt;input_flight_data&gt; -M &lt;output_video_pathname&gt;</w:t>
       </w:r>
     </w:p>
     <w:p>
       <w:pPr>
         <w:pStyle w:val="Heading3"/>
       </w:pPr>
-      <w:bookmarkStart w:id="12" w:name="_Toc191981978"/>
+      <w:bookmarkStart w:id="12" w:name="_Toc230895643"/>
       <w:r>
         <w:t>Additional Tips</w:t>
       </w:r>
@@ -2586,13 +2429,8 @@
           <w:numId w:val="5"/>
         </w:numPr>
       </w:pPr>
-      <w:proofErr w:type="spellStart"/>
-      <w:r>
-        <w:t>Shift+w</w:t>
-      </w:r>
-      <w:proofErr w:type="spellEnd"/>
-      <w:r>
-        <w:t xml:space="preserve"> for HUD</w:t>
+      <w:r>
+        <w:t>Shift+w for HUD</w:t>
       </w:r>
     </w:p>
     <w:p>
@@ -2629,7 +2467,7 @@
       <w:pPr>
         <w:pStyle w:val="Heading3"/>
       </w:pPr>
-      <w:bookmarkStart w:id="13" w:name="_Toc191981979"/>
+      <w:bookmarkStart w:id="13" w:name="_Toc230895644"/>
       <w:r>
         <w:t>Generating Flight Video</w:t>
       </w:r>
@@ -2657,31 +2495,7 @@
         <w:pStyle w:val="Code"/>
       </w:pPr>
       <w:r>
-        <w:t>BM6toXPlaneVideo -t &lt;</w:t>
-      </w:r>
-      <w:proofErr w:type="spellStart"/>
-      <w:r>
-        <w:t>input_flight_data</w:t>
-      </w:r>
-      <w:proofErr w:type="spellEnd"/>
-      <w:r>
-        <w:t>&gt; -D &lt;</w:t>
-      </w:r>
-      <w:proofErr w:type="spellStart"/>
-      <w:r>
-        <w:t>output_db</w:t>
-      </w:r>
-      <w:proofErr w:type="spellEnd"/>
-      <w:r>
-        <w:t>&gt; -T &lt;</w:t>
-      </w:r>
-      <w:proofErr w:type="spellStart"/>
-      <w:r>
-        <w:t>video_table_name</w:t>
-      </w:r>
-      <w:proofErr w:type="spellEnd"/>
-      <w:r>
-        <w:t>&gt;</w:t>
+        <w:t>BM6toXPlaneVideo -t &lt;input_flight_data&gt; -D &lt;output_db&gt; -T &lt;video_table_name&gt;</w:t>
       </w:r>
     </w:p>
     <w:p>
@@ -2697,15 +2511,7 @@
     </w:p>
     <w:p>
       <w:r>
-        <w:t>The -T option should be one of “</w:t>
-      </w:r>
-      <w:proofErr w:type="spellStart"/>
-      <w:r>
-        <w:t>Video_HUD</w:t>
-      </w:r>
-      <w:proofErr w:type="spellEnd"/>
-      <w:r>
-        <w:t>”, “Video_F4_Cockpit”, and “Video_F4_Chase”</w:t>
+        <w:t>The -T option should be one of “Video_HUD”, “Video_F4_Cockpit”, and “Video_F4_Chase”</w:t>
       </w:r>
       <w:r>
         <w:t xml:space="preserve"> depending on the chosen perspective. </w:t>
@@ -2726,7 +2532,7 @@
       <w:pPr>
         <w:pStyle w:val="Heading2"/>
       </w:pPr>
-      <w:bookmarkStart w:id="14" w:name="_Toc191981980"/>
+      <w:bookmarkStart w:id="14" w:name="_Toc230895645"/>
       <w:r>
         <w:t>Generate Ch</w:t>
       </w:r>
@@ -2766,15 +2572,7 @@
         <w:t>SynthCh10Gen-BM6</w:t>
       </w:r>
       <w:r>
-        <w:t xml:space="preserve"> -v -b &lt;</w:t>
-      </w:r>
-      <w:proofErr w:type="spellStart"/>
-      <w:r>
-        <w:t>input_db</w:t>
-      </w:r>
-      <w:proofErr w:type="spellEnd"/>
-      <w:r>
-        <w:t>&gt; &lt;output_ch10_pathname&gt;</w:t>
+        <w:t xml:space="preserve"> -v -b &lt;input_db&gt; &lt;output_ch10_pathname&gt;</w:t>
       </w:r>
     </w:p>
     <w:p>
@@ -2786,7 +2584,7 @@
       <w:pPr>
         <w:pStyle w:val="Heading1"/>
       </w:pPr>
-      <w:bookmarkStart w:id="15" w:name="_Toc191981981"/>
+      <w:bookmarkStart w:id="15" w:name="_Toc230895646"/>
       <w:r>
         <w:t>Verification</w:t>
       </w:r>
@@ -2812,7 +2610,7 @@
       <w:pPr>
         <w:pStyle w:val="Heading1"/>
       </w:pPr>
-      <w:bookmarkStart w:id="16" w:name="_Toc191981982"/>
+      <w:bookmarkStart w:id="16" w:name="_Toc230895647"/>
       <w:r>
         <w:t>Batch Commands</w:t>
       </w:r>
@@ -2855,15 +2653,7 @@
         <w:pStyle w:val="Code"/>
       </w:pPr>
       <w:r>
-        <w:t xml:space="preserve">set </w:t>
-      </w:r>
-      <w:proofErr w:type="spellStart"/>
-      <w:r>
-        <w:t>exedir</w:t>
-      </w:r>
-      <w:proofErr w:type="spellEnd"/>
-      <w:r>
-        <w:t>=C:\atac\vsprojects\SyntheticData\Release</w:t>
+        <w:t>set exedir=C:\atac\vsprojects\SyntheticData\Release</w:t>
       </w:r>
     </w:p>
     <w:p>
@@ -2871,23 +2661,7 @@
         <w:pStyle w:val="Code"/>
       </w:pPr>
       <w:r>
-        <w:t>set PATH=%PATH%;%</w:t>
-      </w:r>
-      <w:proofErr w:type="spellStart"/>
-      <w:r>
-        <w:t>exedir</w:t>
-      </w:r>
-      <w:proofErr w:type="spellEnd"/>
-      <w:r>
-        <w:t>%\..\3rdParty\</w:t>
-      </w:r>
-      <w:proofErr w:type="spellStart"/>
-      <w:r>
-        <w:t>ffmpeg</w:t>
-      </w:r>
-      <w:proofErr w:type="spellEnd"/>
-      <w:r>
-        <w:t>\bin;</w:t>
+        <w:t>set PATH=%PATH%;%exedir%\..\3rdParty\ffmpeg\bin;</w:t>
       </w:r>
     </w:p>
     <w:p>
@@ -3163,15 +2937,7 @@
         <w:pStyle w:val="Code"/>
       </w:pPr>
       <w:r>
-        <w:t xml:space="preserve">set </w:t>
-      </w:r>
-      <w:proofErr w:type="spellStart"/>
-      <w:r>
-        <w:t>infile</w:t>
-      </w:r>
-      <w:proofErr w:type="spellEnd"/>
-      <w:r>
-        <w:t>=%in1%</w:t>
+        <w:t>set infile=%in1%</w:t>
       </w:r>
     </w:p>
     <w:p>
@@ -3179,15 +2945,7 @@
         <w:pStyle w:val="Code"/>
       </w:pPr>
       <w:r>
-        <w:t xml:space="preserve">set </w:t>
-      </w:r>
-      <w:proofErr w:type="spellStart"/>
-      <w:r>
-        <w:t>db</w:t>
-      </w:r>
-      <w:proofErr w:type="spellEnd"/>
-      <w:r>
-        <w:t>=%db1%</w:t>
+        <w:t>set db=%db1%</w:t>
       </w:r>
     </w:p>
     <w:p>
@@ -3219,15 +2977,7 @@
         <w:pStyle w:val="Code"/>
       </w:pPr>
       <w:r>
-        <w:t xml:space="preserve">set </w:t>
-      </w:r>
-      <w:proofErr w:type="spellStart"/>
-      <w:r>
-        <w:t>infile</w:t>
-      </w:r>
-      <w:proofErr w:type="spellEnd"/>
-      <w:r>
-        <w:t>=%in2%</w:t>
+        <w:t>set infile=%in2%</w:t>
       </w:r>
     </w:p>
     <w:p>
@@ -3235,15 +2985,7 @@
         <w:pStyle w:val="Code"/>
       </w:pPr>
       <w:r>
-        <w:t xml:space="preserve">set </w:t>
-      </w:r>
-      <w:proofErr w:type="spellStart"/>
-      <w:r>
-        <w:t>db</w:t>
-      </w:r>
-      <w:proofErr w:type="spellEnd"/>
-      <w:r>
-        <w:t>=%db2%</w:t>
+        <w:t>set db=%db2%</w:t>
       </w:r>
     </w:p>
     <w:p>
@@ -3292,31 +3034,7 @@
         <w:pStyle w:val="Code"/>
       </w:pPr>
       <w:r>
-        <w:t>%</w:t>
-      </w:r>
-      <w:proofErr w:type="spellStart"/>
-      <w:r>
-        <w:t>exedir</w:t>
-      </w:r>
-      <w:proofErr w:type="spellEnd"/>
-      <w:r>
-        <w:t>%\BM6toDB %</w:t>
-      </w:r>
-      <w:proofErr w:type="spellStart"/>
-      <w:r>
-        <w:t>infile</w:t>
-      </w:r>
-      <w:proofErr w:type="spellEnd"/>
-      <w:r>
-        <w:t>% %</w:t>
-      </w:r>
-      <w:proofErr w:type="spellStart"/>
-      <w:r>
-        <w:t>db</w:t>
-      </w:r>
-      <w:proofErr w:type="spellEnd"/>
-      <w:r>
-        <w:t>%</w:t>
+        <w:t>%exedir%\BM6toDB %infile% %db%</w:t>
       </w:r>
     </w:p>
     <w:p>
@@ -3343,52 +3061,15 @@
       </w:pPr>
       <w:r>
         <w:lastRenderedPageBreak/>
-        <w:t>%</w:t>
-      </w:r>
-      <w:proofErr w:type="spellStart"/>
-      <w:r>
-        <w:t>exedir</w:t>
-      </w:r>
-      <w:proofErr w:type="spellEnd"/>
-      <w:r>
-        <w:t>%\BM6toXPlaneVideo %collection% -D %</w:t>
-      </w:r>
-      <w:proofErr w:type="spellStart"/>
-      <w:r>
-        <w:t>db</w:t>
-      </w:r>
-      <w:proofErr w:type="spellEnd"/>
-      <w:r>
-        <w:t xml:space="preserve">% -T </w:t>
-      </w:r>
-      <w:proofErr w:type="spellStart"/>
-      <w:r>
-        <w:t>Video_HUD</w:t>
-      </w:r>
-      <w:proofErr w:type="spellEnd"/>
+        <w:t>%exedir%\BM6toXPlaneVideo %collection% -D %db% -T Video_HUD</w:t>
+      </w:r>
     </w:p>
     <w:p>
       <w:pPr>
         <w:pStyle w:val="Code"/>
       </w:pPr>
       <w:r>
-        <w:t>%</w:t>
-      </w:r>
-      <w:proofErr w:type="spellStart"/>
-      <w:r>
-        <w:t>exedir</w:t>
-      </w:r>
-      <w:proofErr w:type="spellEnd"/>
-      <w:r>
-        <w:t>%\BM6toXPlaneVideo %collection% -D %</w:t>
-      </w:r>
-      <w:proofErr w:type="spellStart"/>
-      <w:r>
-        <w:t>db</w:t>
-      </w:r>
-      <w:proofErr w:type="spellEnd"/>
-      <w:r>
-        <w:t>% -T Video_F4_Cockpit</w:t>
+        <w:t>%exedir%\BM6toXPlaneVideo %collection% -D %db% -T Video_F4_Cockpit</w:t>
       </w:r>
     </w:p>
     <w:p>
@@ -3396,23 +3077,7 @@
         <w:pStyle w:val="Code"/>
       </w:pPr>
       <w:r>
-        <w:t>%</w:t>
-      </w:r>
-      <w:proofErr w:type="spellStart"/>
-      <w:r>
-        <w:t>exedir</w:t>
-      </w:r>
-      <w:proofErr w:type="spellEnd"/>
-      <w:r>
-        <w:t>%\BM6toXPlaneVideo %collection% -D %</w:t>
-      </w:r>
-      <w:proofErr w:type="spellStart"/>
-      <w:r>
-        <w:t>db</w:t>
-      </w:r>
-      <w:proofErr w:type="spellEnd"/>
-      <w:r>
-        <w:t>% -T Video_F4_Chase</w:t>
+        <w:t>%exedir%\BM6toXPlaneVideo %collection% -D %db% -T Video_F4_Chase</w:t>
       </w:r>
     </w:p>
     <w:p>
@@ -3432,26 +3097,54 @@
         <w:pStyle w:val="Code"/>
       </w:pPr>
       <w:r>
-        <w:t>%</w:t>
-      </w:r>
-      <w:proofErr w:type="spellStart"/>
-      <w:r>
-        <w:t>exedir</w:t>
-      </w:r>
-      <w:proofErr w:type="spellEnd"/>
-      <w:r>
-        <w:t>%\SynthCh10Gen-BM6 -v -b %</w:t>
-      </w:r>
-      <w:proofErr w:type="spellStart"/>
-      <w:r>
-        <w:t>db</w:t>
-      </w:r>
-      <w:proofErr w:type="spellEnd"/>
-      <w:r>
-        <w:t>% %ch10%</w:t>
-      </w:r>
-    </w:p>
-    <w:p/>
+        <w:t>%exedir%\SynthCh10Gen-BM6 -v -b %db% %ch10%</w:t>
+      </w:r>
+    </w:p>
+    <w:p>
+      <w:pPr>
+        <w:pStyle w:val="Heading1"/>
+      </w:pPr>
+      <w:bookmarkStart w:id="17" w:name="_Toc230895648"/>
+      <w:r>
+        <w:t>Using the general-purpose Branch</w:t>
+      </w:r>
+      <w:bookmarkEnd w:id="17"/>
+    </w:p>
+    <w:p>
+      <w:r>
+        <w:t>The repository branch named “general-purpose” has a new version of the SynthCh10Gen program which is completely free of the multi-exe paradigm enforced by the old design.</w:t>
+      </w:r>
+      <w:r>
+        <w:t xml:space="preserve"> A new configuration system is in place that allows the user to specify arbitrary channels in JSON.</w:t>
+      </w:r>
+      <w:r>
+        <w:t xml:space="preserve"> </w:t>
+      </w:r>
+    </w:p>
+    <w:p>
+      <w:r>
+        <w:t>The “Configuration Specification.md” found in the Docs directory specifies the expected format of these configuration files. Under “Docs/configs” there are example configurations, and the configuration and scenario files for the “Simultaneous Four” scenario are under “Docs/scenarios/simultaneous_four”.</w:t>
+      </w:r>
+    </w:p>
+    <w:p>
+      <w:r>
+        <w:t>A configuration is used from the command line as follows:</w:t>
+      </w:r>
+    </w:p>
+    <w:p>
+      <w:pPr>
+        <w:pStyle w:val="Code"/>
+      </w:pPr>
+      <w:r>
+        <w:t>%exedir%\</w:t>
+      </w:r>
+      <w:r>
+        <w:t>SynthCh10Gen</w:t>
+      </w:r>
+      <w:r>
+        <w:t xml:space="preserve"> path\to\myconfig.json</w:t>
+      </w:r>
+    </w:p>
     <w:p/>
     <w:p/>
     <w:sectPr>

</xml_diff>